<commit_message>
docs: update teaching plan, syllabi and assignment indexes
</commit_message>
<xml_diff>
--- a/IUEA_Teaching_Plan/IUEA_ML_Semester1_Master_Teaching_Plan.docx
+++ b/IUEA_Teaching_Plan/IUEA_ML_Semester1_Master_Teaching_Plan.docx
@@ -4677,7 +4677,7 @@
                 <w:b/>
                 <w:sz w:val="17"/>
               </w:rPr>
-              <w:t>Weekly quizzes (12 graded, best 10 of 12)</w:t>
+              <w:t>Quizzes (weekly in Weeks 1–6; one sitting per block from Week 8)</w:t>
             </w:r>
           </w:p>
         </w:tc>
@@ -4700,7 +4700,7 @@
                 <w:rFonts w:ascii="Calibri" w:hAnsi="Calibri"/>
                 <w:sz w:val="17"/>
               </w:rPr>
-              <w:t>End of every teaching session: W1–W6, W8–W13</w:t>
+              <w:t>W1–W6 weekly; end of W10 (Block 1) and W13 (Block 2)</w:t>
             </w:r>
           </w:p>
         </w:tc>
@@ -4773,7 +4773,7 @@
                 <w:b/>
                 <w:sz w:val="17"/>
               </w:rPr>
-              <w:t>Practical challenges and assignments (best 8 of 11)</w:t>
+              <w:t>Practical challenges and assignments (weekly in Weeks 1–6; two block packs from Week 8)</w:t>
             </w:r>
           </w:p>
         </w:tc>
@@ -4797,7 +4797,7 @@
                 <w:rFonts w:ascii="Calibri" w:hAnsi="Calibri"/>
                 <w:sz w:val="17"/>
               </w:rPr>
-              <w:t>Weeks 1–12</w:t>
+              <w:t>Weeks 1–6; Block 1 (W8–W10); Block 2 (W11–W12, W13 content in the quiz)</w:t>
             </w:r>
           </w:p>
         </w:tc>
@@ -5677,7 +5677,7 @@
           <w:i w:val="0"/>
           <w:sz w:val="21"/>
         </w:rPr>
-        <w:t>Every teaching session closes with a five-minute quiz of five multiple-choice questions, delivered by a QR code on the projector, taken on the students' own phones in the last five minutes, auto-marked, with the score and a teaching comment released the moment they submit. Twelve are graded, the best ten counting, at one per cent each: Weeks 1 to 6 and Weeks 8 to 13. Weeks 7 and 14 are the practical tests and Week 15 is Demo Day, so those three weeks carry no quiz. The Week 2 proof-of-life submission separately verifies that each student can run and save the supplied notebook.</w:t>
+        <w:t>Every teaching session closes with a five-minute quiz of five multiple-choice questions, delivered by a QR code on the projector, taken on the students' own phones in the last five minutes, auto-marked, with the score and a teaching comment released the moment they submit. Twelve are graded, the best ten counting, at one per cent each: Weeks 1 to 6 and Weeks 8 to 13. Weeks 7 and 14 are the practical tests and Week 15 is Demo Day, so those three weeks carry no quiz. The Week 2 proof-of-life submission separately verifies that each student can run and save the supplied notebook. From Week 8 the arrangement changes: the quizzes and assignments of three classes are combined into one sitting and one pack. Block 1 covers Weeks 8 to 10 and Block 2 covers Weeks 11 to 13. Each quiz form is still five questions and five marks, the three forms of a block are opened together in the last twenty minutes of the Week 10 or Week 13 class, and neither block can be dropped. Best 4 of the six weekly quizzes count from Weeks 1 to 6 (best 3 of five where Week 6 is not assigned), so the quiz total is 50 marks (45), written to 10% of the course. Assignments follow the same rule with a total of 180 marks (160). Full details: Block_Assessment_Arrangement_2026-10-30.md.</w:t>
       </w:r>
     </w:p>
     <w:p>
@@ -5705,7 +5705,7 @@
           <w:i w:val="0"/>
           <w:sz w:val="21"/>
         </w:rPr>
-        <w:t>Two features are worth noting because they follow from auto-marking rather than merely surviving it. Because marking is free, the quiz can run every week rather than five times a semester, which turns it from an occasional gate into a weekly signal for the student and the lecturer alike. And there are no resits: only the best ten of the twelve count, so a student who misses two sessions, or a cohort that loses one to a network failure, is not penalised at all. A sitting lost to the network converts to a 24-hour asynchronous window, and the class is told so before they leave the room.</w:t>
+        <w:t>Two features are worth noting because they follow from auto-marking rather than merely surviving it. Because marking is free, the quiz can run every week rather than five times a semester, which turns it from an occasional gate into a weekly signal for the student and the lecturer alike. And there are no resits: only the best ten of the twelve count, so a student who misses two sessions, or a cohort that loses one to a network failure, is not penalised at all. A sitting lost to the network converts to a 24-hour asynchronous window, and the class is told so before they leave the room. After Week 6 the lowest scores are no longer dropped; the block structure keeps the safety margin by giving each quiz sitting a full 24-hour window and by allowing the block assignment parts to be submitted at any time before the shared close.</w:t>
       </w:r>
     </w:p>
     <w:p>
@@ -12569,7 +12569,7 @@
                 <w:rFonts w:ascii="Calibri" w:hAnsi="Calibri"/>
                 <w:sz w:val="17"/>
               </w:rPr>
-              <w:t>Quiz 7</w:t>
+              <w:t>No quiz (Block 1 quiz in Week 10)</w:t>
             </w:r>
           </w:p>
         </w:tc>
@@ -12711,7 +12711,7 @@
                 <w:rFonts w:ascii="Calibri" w:hAnsi="Calibri"/>
                 <w:sz w:val="17"/>
               </w:rPr>
-              <w:t>Quiz 8</w:t>
+              <w:t>No quiz (Block 1 quiz in Week 10)</w:t>
             </w:r>
           </w:p>
         </w:tc>
@@ -12857,7 +12857,7 @@
                 <w:rFonts w:ascii="Calibri" w:hAnsi="Calibri"/>
                 <w:sz w:val="17"/>
               </w:rPr>
-              <w:t>Quiz 9</w:t>
+              <w:t>Block 1 quiz: Q7, Q8, Q9</w:t>
             </w:r>
           </w:p>
         </w:tc>
@@ -12999,7 +12999,7 @@
                 <w:rFonts w:ascii="Calibri" w:hAnsi="Calibri"/>
                 <w:sz w:val="17"/>
               </w:rPr>
-              <w:t>Quiz 10</w:t>
+              <w:t>No quiz (Block 2 quiz in Week 13)</w:t>
             </w:r>
           </w:p>
         </w:tc>
@@ -13145,7 +13145,7 @@
                 <w:rFonts w:ascii="Calibri" w:hAnsi="Calibri"/>
                 <w:sz w:val="17"/>
               </w:rPr>
-              <w:t>Quiz 11 · integrative</w:t>
+              <w:t>No quiz (Block 2 quiz in Week 13)</w:t>
             </w:r>
           </w:p>
         </w:tc>
@@ -13287,7 +13287,7 @@
                 <w:rFonts w:ascii="Calibri" w:hAnsi="Calibri"/>
                 <w:sz w:val="17"/>
               </w:rPr>
-              <w:t>Quiz 12 · integrative</w:t>
+              <w:t>Block 2 quiz: Q10, Q11, Q12</w:t>
             </w:r>
           </w:p>
         </w:tc>

</xml_diff>